<commit_message>
Xây dựng học phần Nhập môn lập trình (111155), skill CTĐT và cập nhật các học phần
Nhập môn lập trình (111155):
- Đề cương, đánh giá, 12 bài học, 144 câu quiz Aiken, slide 12 buổi
- Lab "săn lỗi" bài 06 (5 đoạn mã có lỗi)
- Giáo trình: đề cương chi tiết, lời nói đầu, chương 1-3 và bài tập hướng dẫn

Công cụ và skill:
- ctdt-builder, build-ctdt.py, validate-ctdt.py, trang hướng dẫn xây dựng CTĐT
- build-images.py: kiểu sơ đồ flowchart
- build-textbook.py: chèn hình vào giáo trình
- Cập nhật giao-trinh-builder, lms-lecture-builder

Các học phần khác: cập nhật Mobile, Web, Kiểm thử, Frontend, Văn hóa, Nhập môn ngành.

Không đưa lên repo (.gitignore): phiếu ý kiến, biên bản họp và danh sách
người góp ý của CTĐT, bộ biểu mẫu CTĐT gốc của Trường, đáp án lab.

Co-Authored-By: Claude Opus 5.5 <noreply@anthropic.com>
</commit_message>
<xml_diff>
--- a/co-so-van-hoa-viet-nam/giao-trinh/Giao-trinh-co-so-van-hoa-viet-nam.docx
+++ b/co-so-van-hoa-viet-nam/giao-trinh/Giao-trinh-co-so-van-hoa-viet-nam.docx
@@ -1045,12 +1045,7 @@
         <w:pStyle w:val="Heading2"/>
       </w:pPr>
       <w:r>
-        <w:t>Quy ước dùng AI</w:t>
-      </w:r>
-    </w:p>
-    <w:p>
-      <w:r>
-        <w:t>Học phần cho phép dùng trợ lý AI và công cụ tạo ảnh (Midjourney, DALL-E) để tìm ý, phác thảo bố cục và moodboard. Ba nguyên tắc áp dụng cho mọi sản phẩm:</w:t>
+        <w:t>Học liệu đi kèm</w:t>
       </w:r>
     </w:p>
     <w:p>
@@ -1062,14 +1057,27 @@
         <w:ind w:left="454" w:hanging="340"/>
       </w:pPr>
       <w:r>
-        <w:t>1.</w:t>
+        <w:t>•</w:t>
         <w:tab/>
       </w:r>
       <w:r>
         <w:rPr>
           <w:b/>
         </w:rPr>
-        <w:t>Nộp kèm prompt đã dùng.</w:t>
+        <w:t>Bài học trên LMS</w:t>
+      </w:r>
+      <w:r>
+        <w:t xml:space="preserve"> (</w:t>
+      </w:r>
+      <w:r>
+        <w:rPr>
+          <w:rFonts w:ascii="Consolas" w:hAnsi="Consolas" w:eastAsia="Consolas"/>
+          <w:sz w:val="22"/>
+        </w:rPr>
+        <w:t>bai-XX</w:t>
+      </w:r>
+      <w:r>
+        <w:t>): mỗi buổi một trang gồm mục tiêu, nội dung, hoạt động và bài luyện tập; nội dung khớp với chương cùng số.</w:t>
       </w:r>
     </w:p>
     <w:p>
@@ -1081,17 +1089,27 @@
         <w:ind w:left="454" w:hanging="340"/>
       </w:pPr>
       <w:r>
-        <w:t>2.</w:t>
+        <w:t>•</w:t>
         <w:tab/>
       </w:r>
       <w:r>
         <w:rPr>
           <w:b/>
         </w:rPr>
-        <w:t>Kiểm chứng thông tin</w:t>
-      </w:r>
-      <w:r>
-        <w:t xml:space="preserve"> do AI đưa ra bằng giáo trình hoặc nguồn uy tín; AI thường sai niên đại, tên gọi và ý nghĩa biểu tượng.</w:t>
+        <w:t>Slide bài giảng</w:t>
+      </w:r>
+      <w:r>
+        <w:t xml:space="preserve"> (</w:t>
+      </w:r>
+      <w:r>
+        <w:rPr>
+          <w:rFonts w:ascii="Consolas" w:hAnsi="Consolas" w:eastAsia="Consolas"/>
+          <w:sz w:val="22"/>
+        </w:rPr>
+        <w:t>Slides/bai-XX.pptx</w:t>
+      </w:r>
+      <w:r>
+        <w:t>): dùng trên lớp, có ghi chú giảng viên.</w:t>
       </w:r>
     </w:p>
     <w:p>
@@ -1103,6 +1121,124 @@
         <w:ind w:left="454" w:hanging="340"/>
       </w:pPr>
       <w:r>
+        <w:t>•</w:t>
+        <w:tab/>
+      </w:r>
+      <w:r>
+        <w:rPr>
+          <w:b/>
+        </w:rPr>
+        <w:t>Ngân hàng câu hỏi trắc nghiệm</w:t>
+      </w:r>
+      <w:r>
+        <w:t xml:space="preserve"> (</w:t>
+      </w:r>
+      <w:r>
+        <w:rPr>
+          <w:rFonts w:ascii="Consolas" w:hAnsi="Consolas" w:eastAsia="Consolas"/>
+          <w:sz w:val="22"/>
+        </w:rPr>
+        <w:t>quiz/</w:t>
+      </w:r>
+      <w:r>
+        <w:t>): luyện tập cuối mỗi bài trên web và import vào Moodle.</w:t>
+      </w:r>
+    </w:p>
+    <w:p>
+      <w:pPr>
+        <w:tabs>
+          <w:tab w:pos="454" w:val="left"/>
+        </w:tabs>
+        <w:spacing w:after="60"/>
+        <w:ind w:left="454" w:hanging="340"/>
+      </w:pPr>
+      <w:r>
+        <w:t>•</w:t>
+        <w:tab/>
+      </w:r>
+      <w:r>
+        <w:rPr>
+          <w:b/>
+        </w:rPr>
+        <w:t>Thông tin học phần, trang đánh giá và rubric chấm điểm theo CLO</w:t>
+      </w:r>
+      <w:r>
+        <w:t xml:space="preserve"> (</w:t>
+      </w:r>
+      <w:r>
+        <w:rPr>
+          <w:rFonts w:ascii="Consolas" w:hAnsi="Consolas" w:eastAsia="Consolas"/>
+          <w:sz w:val="22"/>
+        </w:rPr>
+        <w:t>rubric/</w:t>
+      </w:r>
+      <w:r>
+        <w:t>).</w:t>
+      </w:r>
+    </w:p>
+    <w:p>
+      <w:pPr>
+        <w:pStyle w:val="Heading2"/>
+      </w:pPr>
+      <w:r>
+        <w:t>Quy ước dùng AI</w:t>
+      </w:r>
+    </w:p>
+    <w:p>
+      <w:r>
+        <w:t>Học phần cho phép dùng trợ lý AI và công cụ tạo ảnh (Midjourney, DALL-E) để tìm ý, phác thảo bố cục và moodboard. Ba nguyên tắc áp dụng cho mọi sản phẩm:</w:t>
+      </w:r>
+    </w:p>
+    <w:p>
+      <w:pPr>
+        <w:tabs>
+          <w:tab w:pos="454" w:val="left"/>
+        </w:tabs>
+        <w:spacing w:after="60"/>
+        <w:ind w:left="454" w:hanging="340"/>
+      </w:pPr>
+      <w:r>
+        <w:t>1.</w:t>
+        <w:tab/>
+      </w:r>
+      <w:r>
+        <w:rPr>
+          <w:b/>
+        </w:rPr>
+        <w:t>Nộp kèm prompt đã dùng.</w:t>
+      </w:r>
+    </w:p>
+    <w:p>
+      <w:pPr>
+        <w:tabs>
+          <w:tab w:pos="454" w:val="left"/>
+        </w:tabs>
+        <w:spacing w:after="60"/>
+        <w:ind w:left="454" w:hanging="340"/>
+      </w:pPr>
+      <w:r>
+        <w:t>2.</w:t>
+        <w:tab/>
+      </w:r>
+      <w:r>
+        <w:rPr>
+          <w:b/>
+        </w:rPr>
+        <w:t>Kiểm chứng thông tin</w:t>
+      </w:r>
+      <w:r>
+        <w:t xml:space="preserve"> do AI đưa ra bằng giáo trình hoặc nguồn uy tín; AI thường sai niên đại, tên gọi và ý nghĩa biểu tượng.</w:t>
+      </w:r>
+    </w:p>
+    <w:p>
+      <w:pPr>
+        <w:tabs>
+          <w:tab w:pos="454" w:val="left"/>
+        </w:tabs>
+        <w:spacing w:after="60"/>
+        <w:ind w:left="454" w:hanging="340"/>
+      </w:pPr>
+      <w:r>
         <w:t>3.</w:t>
         <w:tab/>
       </w:r>
@@ -1114,6 +1250,17 @@
       </w:r>
       <w:r>
         <w:t xml:space="preserve"> và luôn ghi chú khi một hình ảnh được tạo bằng AI.</w:t>
+      </w:r>
+    </w:p>
+    <w:p>
+      <w:r>
+        <w:rPr>
+          <w:b/>
+        </w:rPr>
+        <w:t>AI trong quá trình biên soạn.</w:t>
+      </w:r>
+      <w:r>
+        <w:t xml:space="preserve"> Bản thảo giáo trình được soạn với sự hỗ trợ của trợ lý AI ở các khâu: lập dàn ý, diễn đạt, viết mã nguồn ví dụ, vẽ sơ đồ và rà soát định dạng. Nội dung chuyên môn được đối chiếu với tài liệu tham khảo ghi ở cuối mỗi chương; người biên soạn chịu trách nhiệm về tính chính xác, bản quyền và toàn bộ nội dung của giáo trình.</w:t>
       </w:r>
     </w:p>
     <w:p>
@@ -1408,7 +1555,7 @@
               <w:rPr>
                 <w:sz w:val="22"/>
               </w:rPr>
-              <w:t>Vì lẽ sinh tồn và mục đích cuộc sống, loài người sáng tạo ra ngôn ngữ, chữ viết, đạo đức, pháp luật, khoa học, tôn giáo, văn học, nghệ thuật, công cụ sinh hoạt; toàn bộ những sáng tạo và phát minh đó là văn hóa [3]</w:t>
+              <w:t>Vì lẽ sinh tồn và mục đích cuộc sống, loài người sáng tạo ra ngôn ngữ, chữ viết, đạo đức, pháp luật, khoa học, tôn giáo, văn học, nghệ thuật, công cụ sinh hoạt; toàn bộ những sáng tạo và phát minh đó là văn hóa [3, tr. 458]</w:t>
             </w:r>
           </w:p>
         </w:tc>
@@ -7053,7 +7200,7 @@
     </w:p>
     <w:p>
       <w:r>
-        <w:t>Nho giáo được quan lại phương Bắc truyền bá từ đầu Công nguyên nhưng chưa có chỗ đứng trong suốt thời chống Bắc thuộc. Năm 1070, Lý Thánh Tông lập Văn Miếu, đánh dấu Nho giáo được tiếp nhận chính thức. Nho giáo ở Việt Nam chủ yếu là Tống Nho; nó thịnh nhất dưới thời Lê [1, ch. VI, §3.3]. Khi vào Việt Nam, Nho giáo bị truyền thống coi trọng làng và nước, tinh thần dân chủ làng xã làm cho biến đổi.</w:t>
+        <w:t>Nho giáo được quan lại phương Bắc truyền bá từ đầu Công nguyên nhưng chưa có chỗ đứng trong suốt thời chống Bắc thuộc. Năm 1070, Lý Thánh Tông cho dựng Văn Miếu; năm 1076, Lý Nhân Tông cho lập Quốc Tử Giám [2]. Hai sự kiện này đánh dấu Nho giáo được tiếp nhận chính thức. Nho giáo ở Việt Nam chủ yếu là Tống Nho; nó thịnh nhất dưới thời Lê [1, ch. VI, §3.3]. Khi vào Việt Nam, Nho giáo bị truyền thống coi trọng làng và nước, tinh thần dân chủ làng xã làm cho biến đổi.</w:t>
       </w:r>
     </w:p>
     <w:p>
@@ -8228,6 +8375,20 @@
       </w:r>
       <w:r>
         <w:t>. Hà Nội: NXB Giáo dục Việt Nam, 2022.</w:t>
+      </w:r>
+    </w:p>
+    <w:p>
+      <w:r>
+        <w:t xml:space="preserve">[2] Trung tâm Hoạt động Văn hóa Khoa học Văn Miếu – Quốc Tử Giám, "Lịch sử di tích," </w:t>
+      </w:r>
+      <w:r>
+        <w:rPr>
+          <w:i/>
+        </w:rPr>
+        <w:t>Văn Miếu – Quốc Tử Giám</w:t>
+      </w:r>
+      <w:r>
+        <w:t>. Accessed: Oct. 31, 2026. [Online]. Available: https://vanmieu.gov.vn/vi/introduction/site-history</w:t>
       </w:r>
     </w:p>
     <w:p>
@@ -10933,7 +11094,7 @@
     </w:p>
     <w:p>
       <w:r>
-        <w:t>[2] UNESCO, "Viet Nam – Elements on the Lists of Intangible Cultural Heritage," Intangible Cultural Heritage. [Online]. Available: https://ich.unesco.org/en/state/viet-nam-VN</w:t>
+        <w:t>[2] UNESCO, "Viet Nam – Elements on the Lists of Intangible Cultural Heritage," Intangible Cultural Heritage. Accessed: Oct. 31, 2026. [Online]. Available: https://ich.unesco.org/en/state/viet-nam-VN</w:t>
       </w:r>
     </w:p>
     <w:p>
@@ -11138,7 +11299,16 @@
         <w:t>Tín ngưỡng sùng bái tự nhiên:</w:t>
       </w:r>
       <w:r>
-        <w:t xml:space="preserve"> đa thần, nữ thần chiếm ưu thế; tục thờ Mẫu là một tín ngưỡng Việt Nam điển hình.</w:t>
+        <w:t xml:space="preserve"> đa thần, nữ thần chiếm ưu thế; tục thờ Mẫu là một tín ngưỡng Việt Nam điển hình. Năm 2016, </w:t>
+      </w:r>
+      <w:r>
+        <w:rPr>
+          <w:i/>
+        </w:rPr>
+        <w:t>Thực hành tín ngưỡng thờ Mẫu Tam phủ của người Việt</w:t>
+      </w:r>
+      <w:r>
+        <w:t xml:space="preserve"> được UNESCO ghi vào Danh sách di sản văn hóa phi vật thể đại diện của nhân loại [2].</w:t>
       </w:r>
     </w:p>
     <w:p>
@@ -11258,6 +11428,20 @@
       </w:r>
       <w:r>
         <w:t xml:space="preserve"> kiến trúc, điêu khắc, hội họa, đồ gốm, tranh dân gian.</w:t>
+      </w:r>
+    </w:p>
+    <w:p>
+      <w:r>
+        <w:t xml:space="preserve">Nhiều loại hình trong số này đã được UNESCO ghi danh [2]: nhã nhạc cung đình Huế (ghi vào Danh sách đại diện năm 2008), dân ca quan họ Bắc Ninh (2009), đờn ca tài tử Nam Bộ (2013), dân ca ví, giặm Nghệ Tĩnh (2014), nghệ thuật bài chòi Trung Bộ và hát xoan Phú Thọ (2017), nghệ thuật xòe Thái (2021). Ca trù (2009), nghệ thuật làm gốm của người Chăm (2022) và nghề làm tranh dân gian Đông Hồ (2025) nằm trong </w:t>
+      </w:r>
+      <w:r>
+        <w:rPr>
+          <w:b/>
+        </w:rPr>
+        <w:t>Danh sách cần bảo vệ khẩn cấp</w:t>
+      </w:r>
+      <w:r>
+        <w:t>: đây là chất liệu hấp dẫn nhưng mong manh, càng cần được giới thiệu đúng và tôn trọng người nắm giữ di sản.</w:t>
       </w:r>
     </w:p>
     <w:p>
@@ -14713,6 +14897,20 @@
       </w:r>
     </w:p>
     <w:p>
+      <w:r>
+        <w:t xml:space="preserve">[2] UNESCO, "Viet Nam – Elements on the Lists of Intangible Cultural Heritage," </w:t>
+      </w:r>
+      <w:r>
+        <w:rPr>
+          <w:i/>
+        </w:rPr>
+        <w:t>Intangible Cultural Heritage</w:t>
+      </w:r>
+      <w:r>
+        <w:t>. Accessed: Oct. 31, 2026. [Online]. Available: https://ich.unesco.org/en/state/viet-nam-VN</w:t>
+      </w:r>
+    </w:p>
+    <w:p>
       <w:pPr>
         <w:pStyle w:val="Heading1"/>
         <w:pageBreakBefore/>
@@ -15091,7 +15289,7 @@
     </w:p>
     <w:p>
       <w:r>
-        <w:t>Công nghiệp văn hóa và sáng tạo là các ngành biến giá trị văn hóa thành sản phẩm, dịch vụ. Chiến lược phát triển các ngành công nghiệp văn hóa Việt Nam (Quyết định số 1755/QĐ-TTg năm 2016) xác định 12 ngành, trong đó có quảng cáo, điện ảnh, thiết kế, phần mềm và trò chơi giải trí, truyền hình và phát thanh, du lịch văn hóa [3]. Người học truyền thông đa phương tiện sẽ làm việc trong chính những ngành này: sản phẩm của bạn vừa có giá trị kinh tế, vừa góp phần định hình hình ảnh văn hóa Việt Nam. Đọc thêm về công nghiệp văn hóa và sáng tạo ở Việt Nam trong [4], về văn hóa Việt Nam trong chuyển đổi số trong [5].</w:t>
+        <w:t>Công nghiệp văn hóa và sáng tạo là các ngành biến giá trị văn hóa thành sản phẩm, dịch vụ. Chiến lược phát triển các ngành công nghiệp văn hóa Việt Nam đến năm 2030, tầm nhìn đến năm 2045 (Quyết định số 2486/QĐ-TTg ngày 14/11/2025, thay thế Quyết định số 1755/QĐ-TTg năm 2016) ưu tiên phát triển 10 ngành: điện ảnh; mỹ thuật, nhiếp ảnh và triển lãm; nghệ thuật biểu diễn; phần mềm và các trò chơi giải trí; quảng cáo; thủ công mỹ nghệ; du lịch văn hóa; thiết kế sáng tạo; truyền hình và phát thanh; xuất bản [3]. Chiến lược đặt mục tiêu đến năm 2030 các ngành này đóng góp khoảng 7% GDP [3]. Người học truyền thông đa phương tiện sẽ làm việc trong chính những ngành này: sản phẩm của bạn vừa có giá trị kinh tế, vừa góp phần định hình hình ảnh văn hóa Việt Nam. Đọc thêm về công nghiệp văn hóa và sáng tạo ở Việt Nam trong [4], về văn hóa Việt Nam trong chuyển đổi số trong [5].</w:t>
       </w:r>
     </w:p>
     <w:p>
@@ -18548,7 +18746,7 @@
     </w:p>
     <w:p>
       <w:r>
-        <w:t>[3] Thủ tướng Chính phủ, "Quyết định số 1755/QĐ-TTg phê duyệt Chiến lược phát triển các ngành công nghiệp văn hóa Việt Nam đến năm 2020, tầm nhìn đến năm 2030," Hà Nội, 2016.</w:t>
+        <w:t>[3] Thủ tướng Chính phủ, "Quyết định số 2486/QĐ-TTg phê duyệt Chiến lược phát triển các ngành công nghiệp văn hóa Việt Nam đến năm 2030, tầm nhìn đến năm 2045," Hà Nội, 14/11/2025. {{CẦN KIỂM TRA: đối chiếu bản gốc trên Công báo; nội dung trên lấy theo Báo Văn hóa và Tạp chí Công Thương}}</w:t>
       </w:r>
     </w:p>
     <w:p>
@@ -18586,7 +18784,7 @@
     </w:p>
     <w:p>
       <w:r>
-        <w:t>[7] Quốc hội, "Luật Sở hữu trí tuệ, Luật số 50/2005/QH11 (sửa đổi, bổ sung năm 2009, 2019, 2022)," Hà Nội, 2005.</w:t>
+        <w:t>[7] Quốc hội, "Luật Sở hữu trí tuệ, Luật số 50/2005/QH11, được sửa đổi, bổ sung bởi Luật số 36/2009/QH12, Luật số 42/2019/QH14, Luật số 07/2022/QH15, Luật số 93/2025/QH15 và Luật số 131/2025/QH15," Hà Nội.</w:t>
       </w:r>
     </w:p>
     <w:sectPr>

</xml_diff>